<commit_message>
Enhance Mobility demand template and ops replay
</commit_message>
<xml_diff>
--- a/Docx Files Template/AT&TMobility2023BargainingSuggestion_Form.docx
+++ b/Docx Files Template/AT&TMobility2023BargainingSuggestion_Form.docx
@@ -4,6 +4,7 @@
   <w:body>
     <w:p>
       <w:pPr>
+        <w:spacing w:after="160"/>
         <w:jc w:val="center"/>
       </w:pPr>
       <w:r>
@@ -48,7 +49,7 @@
                     <a:graphicData uri="http://schemas.openxmlformats.org/drawingml/2006/picture">
                       <pic:pic>
                         <pic:nvPicPr>
-                          <pic:cNvPr id="0" name="tmpo406i2bl.png"/>
+                          <pic:cNvPr id="0" name="tmpw7cpzmu5.png"/>
                           <pic:cNvPicPr/>
                         </pic:nvPicPr>
                         <pic:blipFill>
@@ -139,6 +140,7 @@
     </w:tbl>
     <w:p>
       <w:pPr>
+        <w:spacing w:before="120" w:after="120"/>
         <w:jc w:val="center"/>
       </w:pPr>
       <w:r>
@@ -151,6 +153,7 @@
     </w:p>
     <w:p>
       <w:pPr>
+        <w:spacing w:after="60"/>
         <w:jc w:val="right"/>
       </w:pPr>
       <w:r>
@@ -169,6 +172,7 @@
     </w:p>
     <w:p>
       <w:pPr>
+        <w:spacing w:after="120"/>
         <w:jc w:val="left"/>
       </w:pPr>
       <w:r>
@@ -187,6 +191,7 @@
     </w:p>
     <w:p>
       <w:pPr>
+        <w:spacing w:after="120"/>
         <w:jc w:val="left"/>
       </w:pPr>
       <w:r>
@@ -205,6 +210,7 @@
     </w:p>
     <w:p>
       <w:pPr>
+        <w:spacing w:after="120"/>
         <w:jc w:val="left"/>
       </w:pPr>
       <w:r>
@@ -222,6 +228,9 @@
       </w:r>
     </w:p>
     <w:p>
+      <w:pPr>
+        <w:spacing w:before="0" w:after="0"/>
+      </w:pPr>
       <w:r>
         <w:rPr>
           <w:b/>
@@ -230,26 +239,107 @@
         <w:t>DEMAND:</w:t>
       </w:r>
     </w:p>
-    <w:p>
-      <w:r>
-        <w:t>{%p for line in demand_rows %}</w:t>
-      </w:r>
-    </w:p>
+    <w:tbl>
+      <w:tblPr>
+        <w:tblW w:type="auto" w:w="0"/>
+        <w:jc w:val="left"/>
+        <w:tblLayout w:type="fixed"/>
+        <w:tblLook w:firstColumn="1" w:firstRow="1" w:lastColumn="0" w:lastRow="0" w:noHBand="0" w:noVBand="1" w:val="04A0"/>
+      </w:tblPr>
+      <w:tblGrid>
+        <w:gridCol w:w="9288"/>
+      </w:tblGrid>
+      <w:tr>
+        <w:trPr>
+          <w:trHeight w:val="40" w:hRule="atLeast"/>
+        </w:trPr>
+        <w:tc>
+          <w:tcPr>
+            <w:tcW w:type="dxa" w:w="10224"/>
+            <w:tcBorders>
+              <w:left w:val="nil"/>
+              <w:top w:val="nil"/>
+              <w:right w:val="nil"/>
+              <w:bottom w:val="nil"/>
+            </w:tcBorders>
+            <w:tcMar>
+              <w:top w:w="0" w:type="dxa"/>
+              <w:start w:w="0" w:type="dxa"/>
+              <w:bottom w:w="0" w:type="dxa"/>
+              <w:end w:w="0" w:type="dxa"/>
+            </w:tcMar>
+          </w:tcPr>
+          <w:p>
+            <w:r>
+              <w:t>{%tr for line in demand_rows %}</w:t>
+            </w:r>
+          </w:p>
+        </w:tc>
+      </w:tr>
+      <w:tr>
+        <w:trPr>
+          <w:trHeight w:val="180" w:hRule="atLeast"/>
+        </w:trPr>
+        <w:tc>
+          <w:tcPr>
+            <w:tcW w:type="dxa" w:w="10224"/>
+            <w:vAlign w:val="top"/>
+            <w:tcBorders>
+              <w:left w:val="nil"/>
+              <w:top w:val="nil"/>
+              <w:right w:val="nil"/>
+              <w:bottom w:val="single" w:sz="8" w:color="000000"/>
+            </w:tcBorders>
+            <w:tcMar>
+              <w:top w:w="0" w:type="dxa"/>
+              <w:start w:w="90" w:type="dxa"/>
+              <w:bottom w:w="0" w:type="dxa"/>
+              <w:end w:w="36" w:type="dxa"/>
+            </w:tcMar>
+          </w:tcPr>
+          <w:p>
+            <w:pPr>
+              <w:spacing w:before="0" w:after="0" w:line="240" w:lineRule="auto"/>
+              <w:jc w:val="left"/>
+            </w:pPr>
+            <w:r>
+              <w:t>{{ line.text }}</w:t>
+            </w:r>
+          </w:p>
+        </w:tc>
+      </w:tr>
+      <w:tr>
+        <w:trPr>
+          <w:trHeight w:val="40" w:hRule="atLeast"/>
+        </w:trPr>
+        <w:tc>
+          <w:tcPr>
+            <w:tcW w:type="dxa" w:w="10224"/>
+            <w:tcBorders>
+              <w:left w:val="nil"/>
+              <w:top w:val="nil"/>
+              <w:right w:val="nil"/>
+              <w:bottom w:val="nil"/>
+            </w:tcBorders>
+            <w:tcMar>
+              <w:top w:w="0" w:type="dxa"/>
+              <w:start w:w="0" w:type="dxa"/>
+              <w:bottom w:w="0" w:type="dxa"/>
+              <w:end w:w="0" w:type="dxa"/>
+            </w:tcMar>
+          </w:tcPr>
+          <w:p>
+            <w:r>
+              <w:t>{%tr endfor %}</w:t>
+            </w:r>
+          </w:p>
+        </w:tc>
+      </w:tr>
+    </w:tbl>
     <w:p>
       <w:pPr>
-        <w:spacing w:after="0"/>
-        <w:ind w:left="216"/>
+        <w:spacing w:before="0" w:after="0"/>
       </w:pPr>
-      <w:r>
-        <w:t>{{ line.text }}</w:t>
-      </w:r>
-    </w:p>
-    <w:p>
-      <w:r>
-        <w:t>{%p endfor %}</w:t>
-      </w:r>
-    </w:p>
-    <w:p>
       <w:r>
         <w:rPr>
           <w:b/>
@@ -258,26 +348,107 @@
         <w:t>REASON:</w:t>
       </w:r>
     </w:p>
-    <w:p>
-      <w:r>
-        <w:t>{%p for line in reason_rows %}</w:t>
-      </w:r>
-    </w:p>
+    <w:tbl>
+      <w:tblPr>
+        <w:tblW w:type="auto" w:w="0"/>
+        <w:jc w:val="left"/>
+        <w:tblLayout w:type="fixed"/>
+        <w:tblLook w:firstColumn="1" w:firstRow="1" w:lastColumn="0" w:lastRow="0" w:noHBand="0" w:noVBand="1" w:val="04A0"/>
+      </w:tblPr>
+      <w:tblGrid>
+        <w:gridCol w:w="9288"/>
+      </w:tblGrid>
+      <w:tr>
+        <w:trPr>
+          <w:trHeight w:val="40" w:hRule="atLeast"/>
+        </w:trPr>
+        <w:tc>
+          <w:tcPr>
+            <w:tcW w:type="dxa" w:w="10224"/>
+            <w:tcBorders>
+              <w:left w:val="nil"/>
+              <w:top w:val="nil"/>
+              <w:right w:val="nil"/>
+              <w:bottom w:val="nil"/>
+            </w:tcBorders>
+            <w:tcMar>
+              <w:top w:w="0" w:type="dxa"/>
+              <w:start w:w="0" w:type="dxa"/>
+              <w:bottom w:w="0" w:type="dxa"/>
+              <w:end w:w="0" w:type="dxa"/>
+            </w:tcMar>
+          </w:tcPr>
+          <w:p>
+            <w:r>
+              <w:t>{%tr for line in reason_rows %}</w:t>
+            </w:r>
+          </w:p>
+        </w:tc>
+      </w:tr>
+      <w:tr>
+        <w:trPr>
+          <w:trHeight w:val="180" w:hRule="atLeast"/>
+        </w:trPr>
+        <w:tc>
+          <w:tcPr>
+            <w:tcW w:type="dxa" w:w="10224"/>
+            <w:vAlign w:val="top"/>
+            <w:tcBorders>
+              <w:left w:val="nil"/>
+              <w:top w:val="nil"/>
+              <w:right w:val="nil"/>
+              <w:bottom w:val="single" w:sz="8" w:color="000000"/>
+            </w:tcBorders>
+            <w:tcMar>
+              <w:top w:w="0" w:type="dxa"/>
+              <w:start w:w="90" w:type="dxa"/>
+              <w:bottom w:w="0" w:type="dxa"/>
+              <w:end w:w="36" w:type="dxa"/>
+            </w:tcMar>
+          </w:tcPr>
+          <w:p>
+            <w:pPr>
+              <w:spacing w:before="0" w:after="0" w:line="240" w:lineRule="auto"/>
+              <w:jc w:val="left"/>
+            </w:pPr>
+            <w:r>
+              <w:t>{{ line.text }}</w:t>
+            </w:r>
+          </w:p>
+        </w:tc>
+      </w:tr>
+      <w:tr>
+        <w:trPr>
+          <w:trHeight w:val="40" w:hRule="atLeast"/>
+        </w:trPr>
+        <w:tc>
+          <w:tcPr>
+            <w:tcW w:type="dxa" w:w="10224"/>
+            <w:tcBorders>
+              <w:left w:val="nil"/>
+              <w:top w:val="nil"/>
+              <w:right w:val="nil"/>
+              <w:bottom w:val="nil"/>
+            </w:tcBorders>
+            <w:tcMar>
+              <w:top w:w="0" w:type="dxa"/>
+              <w:start w:w="0" w:type="dxa"/>
+              <w:bottom w:w="0" w:type="dxa"/>
+              <w:end w:w="0" w:type="dxa"/>
+            </w:tcMar>
+          </w:tcPr>
+          <w:p>
+            <w:r>
+              <w:t>{%tr endfor %}</w:t>
+            </w:r>
+          </w:p>
+        </w:tc>
+      </w:tr>
+    </w:tbl>
     <w:p>
       <w:pPr>
-        <w:spacing w:after="0"/>
-        <w:ind w:left="216"/>
+        <w:spacing w:before="0" w:after="0"/>
       </w:pPr>
-      <w:r>
-        <w:t>{{ line.text }}</w:t>
-      </w:r>
-    </w:p>
-    <w:p>
-      <w:r>
-        <w:t>{%p endfor %}</w:t>
-      </w:r>
-    </w:p>
-    <w:p>
       <w:r>
         <w:rPr>
           <w:b/>
@@ -286,26 +457,107 @@
         <w:t>SPECIFIC EXAMPLES:</w:t>
       </w:r>
     </w:p>
-    <w:p>
-      <w:r>
-        <w:t>{%p for line in specific_examples_rows %}</w:t>
-      </w:r>
-    </w:p>
+    <w:tbl>
+      <w:tblPr>
+        <w:tblW w:type="auto" w:w="0"/>
+        <w:jc w:val="left"/>
+        <w:tblLayout w:type="fixed"/>
+        <w:tblLook w:firstColumn="1" w:firstRow="1" w:lastColumn="0" w:lastRow="0" w:noHBand="0" w:noVBand="1" w:val="04A0"/>
+      </w:tblPr>
+      <w:tblGrid>
+        <w:gridCol w:w="9288"/>
+      </w:tblGrid>
+      <w:tr>
+        <w:trPr>
+          <w:trHeight w:val="40" w:hRule="atLeast"/>
+        </w:trPr>
+        <w:tc>
+          <w:tcPr>
+            <w:tcW w:type="dxa" w:w="10224"/>
+            <w:tcBorders>
+              <w:left w:val="nil"/>
+              <w:top w:val="nil"/>
+              <w:right w:val="nil"/>
+              <w:bottom w:val="nil"/>
+            </w:tcBorders>
+            <w:tcMar>
+              <w:top w:w="0" w:type="dxa"/>
+              <w:start w:w="0" w:type="dxa"/>
+              <w:bottom w:w="0" w:type="dxa"/>
+              <w:end w:w="0" w:type="dxa"/>
+            </w:tcMar>
+          </w:tcPr>
+          <w:p>
+            <w:r>
+              <w:t>{%tr for line in specific_examples_rows %}</w:t>
+            </w:r>
+          </w:p>
+        </w:tc>
+      </w:tr>
+      <w:tr>
+        <w:trPr>
+          <w:trHeight w:val="180" w:hRule="atLeast"/>
+        </w:trPr>
+        <w:tc>
+          <w:tcPr>
+            <w:tcW w:type="dxa" w:w="10224"/>
+            <w:vAlign w:val="top"/>
+            <w:tcBorders>
+              <w:left w:val="nil"/>
+              <w:top w:val="nil"/>
+              <w:right w:val="nil"/>
+              <w:bottom w:val="single" w:sz="8" w:color="000000"/>
+            </w:tcBorders>
+            <w:tcMar>
+              <w:top w:w="0" w:type="dxa"/>
+              <w:start w:w="90" w:type="dxa"/>
+              <w:bottom w:w="0" w:type="dxa"/>
+              <w:end w:w="36" w:type="dxa"/>
+            </w:tcMar>
+          </w:tcPr>
+          <w:p>
+            <w:pPr>
+              <w:spacing w:before="0" w:after="0" w:line="240" w:lineRule="auto"/>
+              <w:jc w:val="left"/>
+            </w:pPr>
+            <w:r>
+              <w:t>{{ line.text }}</w:t>
+            </w:r>
+          </w:p>
+        </w:tc>
+      </w:tr>
+      <w:tr>
+        <w:trPr>
+          <w:trHeight w:val="40" w:hRule="atLeast"/>
+        </w:trPr>
+        <w:tc>
+          <w:tcPr>
+            <w:tcW w:type="dxa" w:w="10224"/>
+            <w:tcBorders>
+              <w:left w:val="nil"/>
+              <w:top w:val="nil"/>
+              <w:right w:val="nil"/>
+              <w:bottom w:val="nil"/>
+            </w:tcBorders>
+            <w:tcMar>
+              <w:top w:w="0" w:type="dxa"/>
+              <w:start w:w="0" w:type="dxa"/>
+              <w:bottom w:w="0" w:type="dxa"/>
+              <w:end w:w="0" w:type="dxa"/>
+            </w:tcMar>
+          </w:tcPr>
+          <w:p>
+            <w:r>
+              <w:t>{%tr endfor %}</w:t>
+            </w:r>
+          </w:p>
+        </w:tc>
+      </w:tr>
+    </w:tbl>
     <w:p>
       <w:pPr>
-        <w:spacing w:after="0"/>
-        <w:ind w:left="216"/>
+        <w:spacing w:before="120"/>
       </w:pPr>
-      <w:r>
-        <w:t>{{ line.text }}</w:t>
-      </w:r>
-    </w:p>
-    <w:p>
-      <w:r>
-        <w:t>{%p endfor %}</w:t>
-      </w:r>
-    </w:p>
-    <w:p>
       <w:r>
         <w:rPr>
           <w:b/>
@@ -337,6 +589,9 @@
       </w:r>
     </w:p>
     <w:p>
+      <w:pPr>
+        <w:spacing w:before="160"/>
+      </w:pPr>
       <w:r>
         <w:rPr>
           <w:b/>
@@ -351,6 +606,7 @@
       </w:r>
     </w:p>
     <w:sectPr>
+      <w:footerReference w:type="default" r:id="rId10"/>
       <w:pgSz w:w="12240" w:h="15840"/>
       <w:pgMar w:top="936" w:right="1008" w:bottom="1008" w:left="1008" w:header="720" w:footer="720" w:gutter="0"/>
       <w:cols w:space="720"/>
@@ -358,6 +614,34 @@
     </w:sectPr>
   </w:body>
 </w:document>
+</file>
+
+<file path=word/footer1.xml><?xml version="1.0" encoding="utf-8"?>
+<w:ftr xmlns:m="http://schemas.openxmlformats.org/officeDocument/2006/math" xmlns:mc="http://schemas.openxmlformats.org/markup-compatibility/2006" xmlns:mo="http://schemas.microsoft.com/office/mac/office/2008/main" xmlns:mv="urn:schemas-microsoft-com:mac:vml" xmlns:o="urn:schemas-microsoft-com:office:office" xmlns:r="http://schemas.openxmlformats.org/officeDocument/2006/relationships" xmlns:v="urn:schemas-microsoft-com:vml" xmlns:w10="urn:schemas-microsoft-com:office:word" xmlns:w14="http://schemas.microsoft.com/office/word/2010/wordml" xmlns:w="http://schemas.openxmlformats.org/wordprocessingml/2006/main" xmlns:wne="http://schemas.microsoft.com/office/word/2006/wordml" xmlns:wp14="http://schemas.microsoft.com/office/word/2010/wordprocessingDrawing" xmlns:wp="http://schemas.openxmlformats.org/drawingml/2006/wordprocessingDrawing" xmlns:wpc="http://schemas.microsoft.com/office/word/2010/wordprocessingCanvas" xmlns:wpg="http://schemas.microsoft.com/office/word/2010/wordprocessingGroup" xmlns:wpi="http://schemas.microsoft.com/office/word/2010/wordprocessingInk" xmlns:wps="http://schemas.microsoft.com/office/word/2010/wordprocessingShape" mc:Ignorable="w14 wp14">
+  <w:p>
+    <w:pPr>
+      <w:pStyle w:val="Footer"/>
+      <w:spacing w:before="0" w:after="0"/>
+      <w:jc w:val="center"/>
+    </w:pPr>
+    <w:r>
+      <w:rPr>
+        <w:rFonts w:ascii="Arial" w:hAnsi="Arial"/>
+        <w:sz w:val="18"/>
+      </w:rPr>
+      <w:t xml:space="preserve">Page </w:t>
+    </w:r>
+    <w:fldSimple w:instr="PAGE">
+      <w:r>
+        <w:rPr>
+          <w:sz w:val="18"/>
+          <w:szCs w:val="18"/>
+        </w:rPr>
+        <w:t>1</w:t>
+      </w:r>
+    </w:fldSimple>
+  </w:p>
+</w:ftr>
 </file>
 
 <file path=word/numbering.xml><?xml version="1.0" encoding="utf-8"?>

</xml_diff>